<commit_message>
tuan4 layer and microkernel
</commit_message>
<xml_diff>
--- a/lab3/ArchitecturalCharacteristic.docx
+++ b/lab3/ArchitecturalCharacteristic.docx
@@ -3125,6 +3125,23 @@
           <w:szCs w:val="26"/>
         </w:rPr>
         <w:t>.</w:t>
+      </w:r>
+    </w:p>
+    <w:p>
+      <w:pPr>
+        <w:rPr>
+          <w:rFonts w:ascii="Times New Roman" w:hAnsi="Times New Roman" w:cs="Times New Roman"/>
+          <w:b/>
+          <w:bCs/>
+        </w:rPr>
+      </w:pPr>
+      <w:r>
+        <w:rPr>
+          <w:rFonts w:ascii="Times New Roman" w:hAnsi="Times New Roman" w:cs="Times New Roman"/>
+          <w:b/>
+          <w:bCs/>
+        </w:rPr>
+        <w:t>Triển khai loadbalance để ví dụ minh họa</w:t>
       </w:r>
     </w:p>
     <w:p>

</xml_diff>